<commit_message>
Incorpora dados medidos das planilhas de monitoramento à resposta
Seção 4 agora cita as medições reais (volume armazenado de 11.813,72 m³
em 26/05 para 10.384,72 m³ em 13/07, evaporação efetiva >2.000 m³ no
bimestre, afluente mensal em queda de 2.066 m³ em fev para 666 m³ em jun)
e novo Anexo II com síntese das medições de cota/volume e do afluente
mensal de 2026.

Co-Authored-By: Claude Fable 5 <noreply@anthropic.com>
Claude-Session: https://claude.ai/code/session_01W45JqiFEv2J5UPsJhHMcdD
</commit_message>
<xml_diff>
--- a/Resposta_Oficio_2565-2026_ETURB.docx
+++ b/Resposta_Oficio_2565-2026_ETURB.docx
@@ -396,48 +396,62 @@
           <w:b w:val="false"/>
           <w:bCs w:val="false"/>
         </w:rPr>
-        <w:t xml:space="preserve">Conforme demonstrado no estudo técnico encaminhado com o Ofício nº 014/2026, o volume máximo de chorume projetado até maio de 2027, em cenário conservador, é da ordem de </w:t>
+        <w:t xml:space="preserve">Os dados reais de monitoramento corroboram esse cenário de segurança. As medições topográficas e aerofotogramétricas (drone) da lagoa em operação registraram </w:t>
       </w:r>
       <w:r>
         <w:rPr>
           <w:b/>
           <w:bCs/>
         </w:rPr>
-        <w:t xml:space="preserve">10.694 m³</w:t>
+        <w:t xml:space="preserve">redução do volume armazenado de 11.813,72 m³, em 26/05/2026, para 10.384,72 m³, em 13/07/2026</w:t>
       </w:r>
       <w:r>
         <w:rPr>
           <w:b w:val="false"/>
           <w:bCs w:val="false"/>
         </w:rPr>
-        <w:t xml:space="preserve"> — inferior, inclusive, à capacidade individual de cada uma das lagoas, e equivalente a cerca de 40% (quarenta por cento) da capacidade total instalada.</w:t>
-      </w:r>
-    </w:p>
-    <w:p>
-      <w:pPr>
-        <w:spacing w:after="120" w:before="0"/>
-        <w:jc w:val="both"/>
-      </w:pPr>
+        <w:t xml:space="preserve"> — queda líquida de aproximadamente 1.429 m³ —, não obstante o aporte contínuo de percolado no mesmo intervalo (cerca de 1.100 m³), o que evidencia </w:t>
+      </w:r>
+      <w:r>
+        <w:rPr>
+          <w:b/>
+          <w:bCs/>
+        </w:rPr>
+        <w:t xml:space="preserve">evaporação efetiva superior a 2.000 m³ em menos de dois meses</w:t>
+      </w:r>
       <w:r>
         <w:rPr>
           <w:b w:val="false"/>
           <w:bCs w:val="false"/>
         </w:rPr>
-        <w:t xml:space="preserve">Soma-se a isso a elevada eficiência do processo de evaporação natural verificada no local: </w:t>
+        <w:t xml:space="preserve">. O nível da lagoa, que atingira a cota máxima de 173,56 m ao final de abril de 2026, encontra-se desde então em trajetória contínua de queda (cota 173,12 m em 13/07/2026).</w:t>
+      </w:r>
+    </w:p>
+    <w:p>
+      <w:pPr>
+        <w:spacing w:after="120" w:before="0"/>
+        <w:jc w:val="both"/>
+      </w:pPr>
+      <w:r>
+        <w:rPr>
+          <w:b w:val="false"/>
+          <w:bCs w:val="false"/>
+        </w:rPr>
+        <w:t xml:space="preserve">No mesmo sentido, o afluente mensal à lagoa (geração de percolado somada à contribuição pluviométrica direta) apresenta acentuada redução: de 2.066 m³ em fevereiro de 2026 — pico do último período chuvoso, com 497 mm de precipitação — para 666 m³ em junho de 2026, o que corresponde a médias diárias de aproximadamente 74 m³/dia e 22 m³/dia, respectivamente. Com a entrada em operação da segunda lagoa, a capacidade livre de armazenamento será de </w:t>
       </w:r>
       <w:r>
         <w:rPr>
           <w:b/>
           <w:bCs/>
         </w:rPr>
-        <w:t xml:space="preserve">somente nos últimos 2 (dois) meses (junho e julho de 2026), registrou-se a evaporação de aproximadamente 2.000 m³ de percolado</w:t>
+        <w:t xml:space="preserve">aproximadamente 15.700 m³ — mais que o dobro de todo o afluente registrado entre janeiro e maio de 2026 (7.284 m³), ainda que se desconsiderasse integralmente o efeito da evaporação</w:t>
       </w:r>
       <w:r>
         <w:rPr>
           <w:b w:val="false"/>
           <w:bCs w:val="false"/>
         </w:rPr>
-        <w:t xml:space="preserve">, em plena consonância com o histórico climatológico da região considerado nas projeções apresentadas.</w:t>
+        <w:t xml:space="preserve">.</w:t>
       </w:r>
     </w:p>
     <w:p>
@@ -446,28 +460,69 @@
         <w:jc w:val="both"/>
       </w:pPr>
       <w:r>
-        <w:t xml:space="preserve">Cumpre observar, com o devido respeito e sem embargo das relevantes competências fiscalizatórias dessa Autarquia no plano contratual, que a avaliação acerca da existência de risco ambiental e da suficiência das medidas de gerenciamento de percolado insere-se na esfera de competência do órgão ambiental licenciador (SEMARH/PI), que acompanha regularmente o empreendimento e suas condicionantes e que, até o presente momento, não formulou qualquer apontamento de risco ou objeção às medidas implementadas. No plano contratual, registre-se que a implantação da solução definitiva de tratamento encontra previsão no Projeto Básico vinculado ao Credenciamento, cujas diretrizes e etapas vêm sendo fielmente observadas por esta empresa, conforme cronograma ora apresentado.</w:t>
-      </w:r>
-    </w:p>
-    <w:p>
-      <w:pPr>
-        <w:spacing w:after="120" w:before="0"/>
-        <w:jc w:val="both"/>
-      </w:pPr>
-      <w:r>
-        <w:t xml:space="preserve">Registre-se, ainda, que essa Autarquia realiza fiscalização semanal no empreendimento, dispondo, portanto, de acompanhamento contínuo e irrestrito das estruturas e medidas em curso. Esta empresa coloca-se, desde já, à disposição para vistoria técnica específica das novas estruturas de contingência, em data a ser designada por essa fiscalização.</w:t>
-      </w:r>
-    </w:p>
-    <w:p>
-      <w:pPr>
-        <w:spacing w:after="120" w:before="240"/>
-        <w:jc w:val="both"/>
-      </w:pPr>
+        <w:rPr>
+          <w:b w:val="false"/>
+          <w:bCs w:val="false"/>
+        </w:rPr>
+        <w:t xml:space="preserve">Tais dados convergem com o estudo técnico encaminhado com o Ofício nº 014/2026, segundo o qual o volume máximo de chorume projetado até maio de 2027, em cenário conservador, é da ordem de </w:t>
+      </w:r>
       <w:r>
         <w:rPr>
           <w:b/>
           <w:bCs/>
         </w:rPr>
+        <w:t xml:space="preserve">10.694 m³</w:t>
+      </w:r>
+      <w:r>
+        <w:rPr>
+          <w:b w:val="false"/>
+          <w:bCs w:val="false"/>
+        </w:rPr>
+        <w:t xml:space="preserve"> — inferior, inclusive, à capacidade individual de cada uma das lagoas, e equivalente a cerca de 40% (quarenta por cento) da capacidade total instalada. A síntese dos dados operacionais de monitoramento integra o </w:t>
+      </w:r>
+      <w:r>
+        <w:rPr>
+          <w:b/>
+          <w:bCs/>
+        </w:rPr>
+        <w:t xml:space="preserve">Anexo II</w:t>
+      </w:r>
+      <w:r>
+        <w:rPr>
+          <w:b w:val="false"/>
+          <w:bCs w:val="false"/>
+        </w:rPr>
+        <w:t xml:space="preserve">.</w:t>
+      </w:r>
+    </w:p>
+    <w:p>
+      <w:pPr>
+        <w:spacing w:after="120" w:before="0"/>
+        <w:jc w:val="both"/>
+      </w:pPr>
+      <w:r>
+        <w:t xml:space="preserve">Cumpre observar, com o devido respeito e sem embargo das relevantes competências fiscalizatórias dessa Autarquia no plano contratual, que a avaliação acerca da existência de risco ambiental e da suficiência das medidas de gerenciamento de percolado insere-se na esfera de competência do órgão ambiental licenciador (SEMARH/PI), que acompanha regularmente o empreendimento e suas condicionantes e que, até o presente momento, não formulou qualquer apontamento de risco ou objeção às medidas implementadas. No plano contratual, registre-se que a implantação da solução definitiva de tratamento encontra previsão no Projeto Básico vinculado ao Credenciamento, cujas diretrizes e etapas vêm sendo fielmente observadas por esta empresa, conforme cronograma ora apresentado.</w:t>
+      </w:r>
+    </w:p>
+    <w:p>
+      <w:pPr>
+        <w:spacing w:after="120" w:before="0"/>
+        <w:jc w:val="both"/>
+      </w:pPr>
+      <w:r>
+        <w:t xml:space="preserve">Registre-se, ainda, que essa Autarquia realiza fiscalização semanal no empreendimento, dispondo, portanto, de acompanhamento contínuo e irrestrito das estruturas e medidas em curso. Esta empresa coloca-se, desde já, à disposição para vistoria técnica específica das novas estruturas de contingência, em data a ser designada por essa fiscalização.</w:t>
+      </w:r>
+    </w:p>
+    <w:p>
+      <w:pPr>
+        <w:spacing w:after="120" w:before="240"/>
+        <w:jc w:val="both"/>
+      </w:pPr>
+      <w:r>
+        <w:rPr>
+          <w:b/>
+          <w:bCs/>
+        </w:rPr>
         <w:t xml:space="preserve">5. DAS TRATATIVAS COM A EMPRESA OXICHEMICAL (ITEM II DA NOTIFICAÇÃO)</w:t>
       </w:r>
     </w:p>
@@ -649,7 +704,7 @@
           <w:b w:val="false"/>
           <w:bCs w:val="false"/>
         </w:rPr>
-        <w:t xml:space="preserve">, ante a demonstração técnica de sua inexequibilidade e da desnecessidade operacional de sua antecipação, sem prejuízo do compromisso de antecipação de etapas sempre que possível;</w:t>
+        <w:t xml:space="preserve">, ante a demonstração técnica de sua inexequibilidade e a desnecessidade operacional de sua antecipação, evidenciada pelos dados de monitoramento (Anexo II), sem prejuízo do compromisso de antecipação de etapas sempre que possível;</w:t>
       </w:r>
     </w:p>
     <w:p>
@@ -687,6 +742,26 @@
       </w:pPr>
       <w:r>
         <w:t xml:space="preserve">Reafirmando o compromisso desta empresa com a adequada execução contratual, com a segurança ambiental do empreendimento e com a plena transparência perante essa fiscalização, colocamo-nos à inteira disposição para reunião técnica e para vistoria às estruturas mencionadas.</w:t>
+      </w:r>
+    </w:p>
+    <w:p>
+      <w:pPr>
+        <w:spacing w:after="120" w:before="0"/>
+        <w:jc w:val="both"/>
+      </w:pPr>
+      <w:r>
+        <w:rPr>
+          <w:b/>
+          <w:bCs/>
+        </w:rPr>
+        <w:t xml:space="preserve">Anexos: </w:t>
+      </w:r>
+      <w:r>
+        <w:rPr>
+          <w:b w:val="false"/>
+          <w:bCs w:val="false"/>
+        </w:rPr>
+        <w:t xml:space="preserve">I – Cronograma físico revisado de implantação da ETE; II – Síntese dos dados operacionais de monitoramento da lagoa de percolado.</w:t>
       </w:r>
     </w:p>
     <w:p>
@@ -2037,6 +2112,977 @@
       </w:pPr>
       <w:r>
         <w:t xml:space="preserve">As etapas foram reduzidas para adiantar a implantação, podendo sofrer alterações (atrasos ou antecipações), dependendo das liberações legais e em casos fortuitos ou força maior.</w:t>
+      </w:r>
+    </w:p>
+    <w:p>
+      <w:r>
+        <w:br w:type="page"/>
+      </w:r>
+    </w:p>
+    <w:p>
+      <w:pPr>
+        <w:spacing w:after="240" w:before="0"/>
+        <w:jc w:val="center"/>
+      </w:pPr>
+      <w:r>
+        <w:rPr>
+          <w:b/>
+          <w:bCs/>
+        </w:rPr>
+        <w:t xml:space="preserve">ANEXO II – SÍNTESE DOS DADOS OPERACIONAIS DE MONITORAMENTO DA LAGOA DE PERCOLADO</w:t>
+      </w:r>
+    </w:p>
+    <w:p>
+      <w:pPr>
+        <w:spacing w:after="120" w:before="0"/>
+        <w:jc w:val="both"/>
+      </w:pPr>
+      <w:r>
+        <w:rPr>
+          <w:b/>
+          <w:bCs/>
+        </w:rPr>
+        <w:t xml:space="preserve">Tabela 1 – Medições de volume armazenado na lagoa em operação</w:t>
+      </w:r>
+      <w:r>
+        <w:rPr>
+          <w:b w:val="false"/>
+          <w:bCs w:val="false"/>
+        </w:rPr>
+        <w:t xml:space="preserve"> (levantamentos topográficos e aerofotogramétricos por drone)</w:t>
+      </w:r>
+    </w:p>
+    <w:tbl>
+      <w:tblPr>
+        <w:tblW w:type="dxa" w:w="9071"/>
+        <w:tblBorders>
+          <w:top w:val="single" w:color="auto" w:sz="4"/>
+          <w:left w:val="single" w:color="auto" w:sz="4"/>
+          <w:bottom w:val="single" w:color="auto" w:sz="4"/>
+          <w:right w:val="single" w:color="auto" w:sz="4"/>
+          <w:insideH w:val="single" w:color="auto" w:sz="4"/>
+          <w:insideV w:val="single" w:color="auto" w:sz="4"/>
+        </w:tblBorders>
+      </w:tblPr>
+      <w:tblGrid>
+        <w:gridCol w:w="3024"/>
+        <w:gridCol w:w="3024"/>
+        <w:gridCol w:w="3023"/>
+      </w:tblGrid>
+      <w:tr>
+        <w:trPr>
+          <w:tblHeader/>
+        </w:trPr>
+        <w:tc>
+          <w:tcPr>
+            <w:tcW w:type="dxa" w:w="3024"/>
+            <w:shd w:fill="E6E6E6" w:color="auto" w:val="clear"/>
+            <w:tcMar>
+              <w:top w:type="dxa" w:w="60"/>
+              <w:left w:type="dxa" w:w="100"/>
+              <w:bottom w:type="dxa" w:w="60"/>
+              <w:right w:type="dxa" w:w="100"/>
+            </w:tcMar>
+            <w:vAlign w:val="center"/>
+          </w:tcPr>
+          <w:p>
+            <w:pPr>
+              <w:spacing w:after="0"/>
+              <w:jc w:val="center"/>
+            </w:pPr>
+            <w:r>
+              <w:rPr>
+                <w:b/>
+                <w:bCs/>
+              </w:rPr>
+              <w:t xml:space="preserve">Data da medição</w:t>
+            </w:r>
+          </w:p>
+        </w:tc>
+        <w:tc>
+          <w:tcPr>
+            <w:tcW w:type="dxa" w:w="3024"/>
+            <w:shd w:fill="E6E6E6" w:color="auto" w:val="clear"/>
+            <w:tcMar>
+              <w:top w:type="dxa" w:w="60"/>
+              <w:left w:type="dxa" w:w="100"/>
+              <w:bottom w:type="dxa" w:w="60"/>
+              <w:right w:type="dxa" w:w="100"/>
+            </w:tcMar>
+            <w:vAlign w:val="center"/>
+          </w:tcPr>
+          <w:p>
+            <w:pPr>
+              <w:spacing w:after="0"/>
+              <w:jc w:val="center"/>
+            </w:pPr>
+            <w:r>
+              <w:rPr>
+                <w:b/>
+                <w:bCs/>
+              </w:rPr>
+              <w:t xml:space="preserve">Cota do nível (m)</w:t>
+            </w:r>
+          </w:p>
+        </w:tc>
+        <w:tc>
+          <w:tcPr>
+            <w:tcW w:type="dxa" w:w="3023"/>
+            <w:shd w:fill="E6E6E6" w:color="auto" w:val="clear"/>
+            <w:tcMar>
+              <w:top w:type="dxa" w:w="60"/>
+              <w:left w:type="dxa" w:w="100"/>
+              <w:bottom w:type="dxa" w:w="60"/>
+              <w:right w:type="dxa" w:w="100"/>
+            </w:tcMar>
+            <w:vAlign w:val="center"/>
+          </w:tcPr>
+          <w:p>
+            <w:pPr>
+              <w:spacing w:after="0"/>
+              <w:jc w:val="center"/>
+            </w:pPr>
+            <w:r>
+              <w:rPr>
+                <w:b/>
+                <w:bCs/>
+              </w:rPr>
+              <w:t xml:space="preserve">Volume armazenado (m³)</w:t>
+            </w:r>
+          </w:p>
+        </w:tc>
+      </w:tr>
+      <w:tr>
+        <w:tc>
+          <w:tcPr>
+            <w:tcW w:type="dxa" w:w="3024"/>
+            <w:tcMar>
+              <w:top w:type="dxa" w:w="60"/>
+              <w:left w:type="dxa" w:w="100"/>
+              <w:bottom w:type="dxa" w:w="60"/>
+              <w:right w:type="dxa" w:w="100"/>
+            </w:tcMar>
+            <w:vAlign w:val="center"/>
+          </w:tcPr>
+          <w:p>
+            <w:pPr>
+              <w:spacing w:after="0"/>
+              <w:jc w:val="center"/>
+            </w:pPr>
+            <w:r>
+              <w:rPr>
+                <w:b w:val="false"/>
+                <w:bCs w:val="false"/>
+              </w:rPr>
+              <w:t xml:space="preserve">26/05/2026</w:t>
+            </w:r>
+          </w:p>
+        </w:tc>
+        <w:tc>
+          <w:tcPr>
+            <w:tcW w:type="dxa" w:w="3024"/>
+            <w:tcMar>
+              <w:top w:type="dxa" w:w="60"/>
+              <w:left w:type="dxa" w:w="100"/>
+              <w:bottom w:type="dxa" w:w="60"/>
+              <w:right w:type="dxa" w:w="100"/>
+            </w:tcMar>
+            <w:vAlign w:val="center"/>
+          </w:tcPr>
+          <w:p>
+            <w:pPr>
+              <w:spacing w:after="0"/>
+              <w:jc w:val="center"/>
+            </w:pPr>
+            <w:r>
+              <w:rPr>
+                <w:b w:val="false"/>
+                <w:bCs w:val="false"/>
+              </w:rPr>
+              <w:t xml:space="preserve">173,51</w:t>
+            </w:r>
+          </w:p>
+        </w:tc>
+        <w:tc>
+          <w:tcPr>
+            <w:tcW w:type="dxa" w:w="3023"/>
+            <w:tcMar>
+              <w:top w:type="dxa" w:w="60"/>
+              <w:left w:type="dxa" w:w="100"/>
+              <w:bottom w:type="dxa" w:w="60"/>
+              <w:right w:type="dxa" w:w="100"/>
+            </w:tcMar>
+            <w:vAlign w:val="center"/>
+          </w:tcPr>
+          <w:p>
+            <w:pPr>
+              <w:spacing w:after="0"/>
+              <w:jc w:val="center"/>
+            </w:pPr>
+            <w:r>
+              <w:rPr>
+                <w:b w:val="false"/>
+                <w:bCs w:val="false"/>
+              </w:rPr>
+              <w:t xml:space="preserve">11.813,72</w:t>
+            </w:r>
+          </w:p>
+        </w:tc>
+      </w:tr>
+      <w:tr>
+        <w:tc>
+          <w:tcPr>
+            <w:tcW w:type="dxa" w:w="3024"/>
+            <w:tcMar>
+              <w:top w:type="dxa" w:w="60"/>
+              <w:left w:type="dxa" w:w="100"/>
+              <w:bottom w:type="dxa" w:w="60"/>
+              <w:right w:type="dxa" w:w="100"/>
+            </w:tcMar>
+            <w:vAlign w:val="center"/>
+          </w:tcPr>
+          <w:p>
+            <w:pPr>
+              <w:spacing w:after="0"/>
+              <w:jc w:val="center"/>
+            </w:pPr>
+            <w:r>
+              <w:rPr>
+                <w:b w:val="false"/>
+                <w:bCs w:val="false"/>
+              </w:rPr>
+              <w:t xml:space="preserve">22/06/2026</w:t>
+            </w:r>
+          </w:p>
+        </w:tc>
+        <w:tc>
+          <w:tcPr>
+            <w:tcW w:type="dxa" w:w="3024"/>
+            <w:tcMar>
+              <w:top w:type="dxa" w:w="60"/>
+              <w:left w:type="dxa" w:w="100"/>
+              <w:bottom w:type="dxa" w:w="60"/>
+              <w:right w:type="dxa" w:w="100"/>
+            </w:tcMar>
+            <w:vAlign w:val="center"/>
+          </w:tcPr>
+          <w:p>
+            <w:pPr>
+              <w:spacing w:after="0"/>
+              <w:jc w:val="center"/>
+            </w:pPr>
+            <w:r>
+              <w:rPr>
+                <w:b w:val="false"/>
+                <w:bCs w:val="false"/>
+              </w:rPr>
+              <w:t xml:space="preserve">173,12</w:t>
+            </w:r>
+          </w:p>
+        </w:tc>
+        <w:tc>
+          <w:tcPr>
+            <w:tcW w:type="dxa" w:w="3023"/>
+            <w:tcMar>
+              <w:top w:type="dxa" w:w="60"/>
+              <w:left w:type="dxa" w:w="100"/>
+              <w:bottom w:type="dxa" w:w="60"/>
+              <w:right w:type="dxa" w:w="100"/>
+            </w:tcMar>
+            <w:vAlign w:val="center"/>
+          </w:tcPr>
+          <w:p>
+            <w:pPr>
+              <w:spacing w:after="0"/>
+              <w:jc w:val="center"/>
+            </w:pPr>
+            <w:r>
+              <w:rPr>
+                <w:b w:val="false"/>
+                <w:bCs w:val="false"/>
+              </w:rPr>
+              <w:t xml:space="preserve">10.384,72</w:t>
+            </w:r>
+          </w:p>
+        </w:tc>
+      </w:tr>
+      <w:tr>
+        <w:tc>
+          <w:tcPr>
+            <w:tcW w:type="dxa" w:w="3024"/>
+            <w:tcMar>
+              <w:top w:type="dxa" w:w="60"/>
+              <w:left w:type="dxa" w:w="100"/>
+              <w:bottom w:type="dxa" w:w="60"/>
+              <w:right w:type="dxa" w:w="100"/>
+            </w:tcMar>
+            <w:vAlign w:val="center"/>
+          </w:tcPr>
+          <w:p>
+            <w:pPr>
+              <w:spacing w:after="0"/>
+              <w:jc w:val="center"/>
+            </w:pPr>
+            <w:r>
+              <w:rPr>
+                <w:b w:val="false"/>
+                <w:bCs w:val="false"/>
+              </w:rPr>
+              <w:t xml:space="preserve">13/07/2026</w:t>
+            </w:r>
+          </w:p>
+        </w:tc>
+        <w:tc>
+          <w:tcPr>
+            <w:tcW w:type="dxa" w:w="3024"/>
+            <w:tcMar>
+              <w:top w:type="dxa" w:w="60"/>
+              <w:left w:type="dxa" w:w="100"/>
+              <w:bottom w:type="dxa" w:w="60"/>
+              <w:right w:type="dxa" w:w="100"/>
+            </w:tcMar>
+            <w:vAlign w:val="center"/>
+          </w:tcPr>
+          <w:p>
+            <w:pPr>
+              <w:spacing w:after="0"/>
+              <w:jc w:val="center"/>
+            </w:pPr>
+            <w:r>
+              <w:rPr>
+                <w:b w:val="false"/>
+                <w:bCs w:val="false"/>
+              </w:rPr>
+              <w:t xml:space="preserve">173,12</w:t>
+            </w:r>
+          </w:p>
+        </w:tc>
+        <w:tc>
+          <w:tcPr>
+            <w:tcW w:type="dxa" w:w="3023"/>
+            <w:tcMar>
+              <w:top w:type="dxa" w:w="60"/>
+              <w:left w:type="dxa" w:w="100"/>
+              <w:bottom w:type="dxa" w:w="60"/>
+              <w:right w:type="dxa" w:w="100"/>
+            </w:tcMar>
+            <w:vAlign w:val="center"/>
+          </w:tcPr>
+          <w:p>
+            <w:pPr>
+              <w:spacing w:after="0"/>
+              <w:jc w:val="center"/>
+            </w:pPr>
+            <w:r>
+              <w:rPr>
+                <w:b w:val="false"/>
+                <w:bCs w:val="false"/>
+              </w:rPr>
+              <w:t xml:space="preserve">10.384,72</w:t>
+            </w:r>
+          </w:p>
+        </w:tc>
+      </w:tr>
+    </w:tbl>
+    <w:p>
+      <w:pPr>
+        <w:spacing w:after="360" w:before="120"/>
+        <w:jc w:val="both"/>
+      </w:pPr>
+      <w:r>
+        <w:t xml:space="preserve">Cota máxima registrada no último período chuvoso: 173,56 m, em 30/04/2026 — em trajetória contínua de queda desde então.</w:t>
+      </w:r>
+    </w:p>
+    <w:p>
+      <w:pPr>
+        <w:spacing w:after="120" w:before="0"/>
+        <w:jc w:val="both"/>
+      </w:pPr>
+      <w:r>
+        <w:rPr>
+          <w:b/>
+          <w:bCs/>
+        </w:rPr>
+        <w:t xml:space="preserve">Tabela 2 – Afluente mensal à lagoa em 2026</w:t>
+      </w:r>
+      <w:r>
+        <w:rPr>
+          <w:b w:val="false"/>
+          <w:bCs w:val="false"/>
+        </w:rPr>
+        <w:t xml:space="preserve"> (geração de percolado + contribuição pluviométrica direta)</w:t>
+      </w:r>
+    </w:p>
+    <w:tbl>
+      <w:tblPr>
+        <w:tblW w:type="dxa" w:w="9071"/>
+        <w:tblBorders>
+          <w:top w:val="single" w:color="auto" w:sz="4"/>
+          <w:left w:val="single" w:color="auto" w:sz="4"/>
+          <w:bottom w:val="single" w:color="auto" w:sz="4"/>
+          <w:right w:val="single" w:color="auto" w:sz="4"/>
+          <w:insideH w:val="single" w:color="auto" w:sz="4"/>
+          <w:insideV w:val="single" w:color="auto" w:sz="4"/>
+        </w:tblBorders>
+      </w:tblPr>
+      <w:tblGrid>
+        <w:gridCol w:w="3024"/>
+        <w:gridCol w:w="3024"/>
+        <w:gridCol w:w="3023"/>
+      </w:tblGrid>
+      <w:tr>
+        <w:trPr>
+          <w:tblHeader/>
+        </w:trPr>
+        <w:tc>
+          <w:tcPr>
+            <w:tcW w:type="dxa" w:w="3024"/>
+            <w:shd w:fill="E6E6E6" w:color="auto" w:val="clear"/>
+            <w:tcMar>
+              <w:top w:type="dxa" w:w="60"/>
+              <w:left w:type="dxa" w:w="100"/>
+              <w:bottom w:type="dxa" w:w="60"/>
+              <w:right w:type="dxa" w:w="100"/>
+            </w:tcMar>
+            <w:vAlign w:val="center"/>
+          </w:tcPr>
+          <w:p>
+            <w:pPr>
+              <w:spacing w:after="0"/>
+              <w:jc w:val="center"/>
+            </w:pPr>
+            <w:r>
+              <w:rPr>
+                <w:b/>
+                <w:bCs/>
+              </w:rPr>
+              <w:t xml:space="preserve">Mês</w:t>
+            </w:r>
+          </w:p>
+        </w:tc>
+        <w:tc>
+          <w:tcPr>
+            <w:tcW w:type="dxa" w:w="3024"/>
+            <w:shd w:fill="E6E6E6" w:color="auto" w:val="clear"/>
+            <w:tcMar>
+              <w:top w:type="dxa" w:w="60"/>
+              <w:left w:type="dxa" w:w="100"/>
+              <w:bottom w:type="dxa" w:w="60"/>
+              <w:right w:type="dxa" w:w="100"/>
+            </w:tcMar>
+            <w:vAlign w:val="center"/>
+          </w:tcPr>
+          <w:p>
+            <w:pPr>
+              <w:spacing w:after="0"/>
+              <w:jc w:val="center"/>
+            </w:pPr>
+            <w:r>
+              <w:rPr>
+                <w:b/>
+                <w:bCs/>
+              </w:rPr>
+              <w:t xml:space="preserve">Precipitação (mm)</w:t>
+            </w:r>
+          </w:p>
+        </w:tc>
+        <w:tc>
+          <w:tcPr>
+            <w:tcW w:type="dxa" w:w="3023"/>
+            <w:shd w:fill="E6E6E6" w:color="auto" w:val="clear"/>
+            <w:tcMar>
+              <w:top w:type="dxa" w:w="60"/>
+              <w:left w:type="dxa" w:w="100"/>
+              <w:bottom w:type="dxa" w:w="60"/>
+              <w:right w:type="dxa" w:w="100"/>
+            </w:tcMar>
+            <w:vAlign w:val="center"/>
+          </w:tcPr>
+          <w:p>
+            <w:pPr>
+              <w:spacing w:after="0"/>
+              <w:jc w:val="center"/>
+            </w:pPr>
+            <w:r>
+              <w:rPr>
+                <w:b/>
+                <w:bCs/>
+              </w:rPr>
+              <w:t xml:space="preserve">Afluente total (m³)</w:t>
+            </w:r>
+          </w:p>
+        </w:tc>
+      </w:tr>
+      <w:tr>
+        <w:tc>
+          <w:tcPr>
+            <w:tcW w:type="dxa" w:w="3024"/>
+            <w:tcMar>
+              <w:top w:type="dxa" w:w="60"/>
+              <w:left w:type="dxa" w:w="100"/>
+              <w:bottom w:type="dxa" w:w="60"/>
+              <w:right w:type="dxa" w:w="100"/>
+            </w:tcMar>
+            <w:vAlign w:val="center"/>
+          </w:tcPr>
+          <w:p>
+            <w:pPr>
+              <w:spacing w:after="0"/>
+              <w:jc w:val="center"/>
+            </w:pPr>
+            <w:r>
+              <w:rPr>
+                <w:b w:val="false"/>
+                <w:bCs w:val="false"/>
+              </w:rPr>
+              <w:t xml:space="preserve">janeiro/2026</w:t>
+            </w:r>
+          </w:p>
+        </w:tc>
+        <w:tc>
+          <w:tcPr>
+            <w:tcW w:type="dxa" w:w="3024"/>
+            <w:tcMar>
+              <w:top w:type="dxa" w:w="60"/>
+              <w:left w:type="dxa" w:w="100"/>
+              <w:bottom w:type="dxa" w:w="60"/>
+              <w:right w:type="dxa" w:w="100"/>
+            </w:tcMar>
+            <w:vAlign w:val="center"/>
+          </w:tcPr>
+          <w:p>
+            <w:pPr>
+              <w:spacing w:after="0"/>
+              <w:jc w:val="center"/>
+            </w:pPr>
+            <w:r>
+              <w:rPr>
+                <w:b w:val="false"/>
+                <w:bCs w:val="false"/>
+              </w:rPr>
+              <w:t xml:space="preserve">215,0</w:t>
+            </w:r>
+          </w:p>
+        </w:tc>
+        <w:tc>
+          <w:tcPr>
+            <w:tcW w:type="dxa" w:w="3023"/>
+            <w:tcMar>
+              <w:top w:type="dxa" w:w="60"/>
+              <w:left w:type="dxa" w:w="100"/>
+              <w:bottom w:type="dxa" w:w="60"/>
+              <w:right w:type="dxa" w:w="100"/>
+            </w:tcMar>
+            <w:vAlign w:val="center"/>
+          </w:tcPr>
+          <w:p>
+            <w:pPr>
+              <w:spacing w:after="0"/>
+              <w:jc w:val="center"/>
+            </w:pPr>
+            <w:r>
+              <w:rPr>
+                <w:b w:val="false"/>
+                <w:bCs w:val="false"/>
+              </w:rPr>
+              <w:t xml:space="preserve">1.486,6</w:t>
+            </w:r>
+          </w:p>
+        </w:tc>
+      </w:tr>
+      <w:tr>
+        <w:tc>
+          <w:tcPr>
+            <w:tcW w:type="dxa" w:w="3024"/>
+            <w:tcMar>
+              <w:top w:type="dxa" w:w="60"/>
+              <w:left w:type="dxa" w:w="100"/>
+              <w:bottom w:type="dxa" w:w="60"/>
+              <w:right w:type="dxa" w:w="100"/>
+            </w:tcMar>
+            <w:vAlign w:val="center"/>
+          </w:tcPr>
+          <w:p>
+            <w:pPr>
+              <w:spacing w:after="0"/>
+              <w:jc w:val="center"/>
+            </w:pPr>
+            <w:r>
+              <w:rPr>
+                <w:b w:val="false"/>
+                <w:bCs w:val="false"/>
+              </w:rPr>
+              <w:t xml:space="preserve">fevereiro/2026</w:t>
+            </w:r>
+          </w:p>
+        </w:tc>
+        <w:tc>
+          <w:tcPr>
+            <w:tcW w:type="dxa" w:w="3024"/>
+            <w:tcMar>
+              <w:top w:type="dxa" w:w="60"/>
+              <w:left w:type="dxa" w:w="100"/>
+              <w:bottom w:type="dxa" w:w="60"/>
+              <w:right w:type="dxa" w:w="100"/>
+            </w:tcMar>
+            <w:vAlign w:val="center"/>
+          </w:tcPr>
+          <w:p>
+            <w:pPr>
+              <w:spacing w:after="0"/>
+              <w:jc w:val="center"/>
+            </w:pPr>
+            <w:r>
+              <w:rPr>
+                <w:b w:val="false"/>
+                <w:bCs w:val="false"/>
+              </w:rPr>
+              <w:t xml:space="preserve">497,0</w:t>
+            </w:r>
+          </w:p>
+        </w:tc>
+        <w:tc>
+          <w:tcPr>
+            <w:tcW w:type="dxa" w:w="3023"/>
+            <w:tcMar>
+              <w:top w:type="dxa" w:w="60"/>
+              <w:left w:type="dxa" w:w="100"/>
+              <w:bottom w:type="dxa" w:w="60"/>
+              <w:right w:type="dxa" w:w="100"/>
+            </w:tcMar>
+            <w:vAlign w:val="center"/>
+          </w:tcPr>
+          <w:p>
+            <w:pPr>
+              <w:spacing w:after="0"/>
+              <w:jc w:val="center"/>
+            </w:pPr>
+            <w:r>
+              <w:rPr>
+                <w:b w:val="false"/>
+                <w:bCs w:val="false"/>
+              </w:rPr>
+              <w:t xml:space="preserve">2.066,5</w:t>
+            </w:r>
+          </w:p>
+        </w:tc>
+      </w:tr>
+      <w:tr>
+        <w:tc>
+          <w:tcPr>
+            <w:tcW w:type="dxa" w:w="3024"/>
+            <w:tcMar>
+              <w:top w:type="dxa" w:w="60"/>
+              <w:left w:type="dxa" w:w="100"/>
+              <w:bottom w:type="dxa" w:w="60"/>
+              <w:right w:type="dxa" w:w="100"/>
+            </w:tcMar>
+            <w:vAlign w:val="center"/>
+          </w:tcPr>
+          <w:p>
+            <w:pPr>
+              <w:spacing w:after="0"/>
+              <w:jc w:val="center"/>
+            </w:pPr>
+            <w:r>
+              <w:rPr>
+                <w:b w:val="false"/>
+                <w:bCs w:val="false"/>
+              </w:rPr>
+              <w:t xml:space="preserve">março/2026</w:t>
+            </w:r>
+          </w:p>
+        </w:tc>
+        <w:tc>
+          <w:tcPr>
+            <w:tcW w:type="dxa" w:w="3024"/>
+            <w:tcMar>
+              <w:top w:type="dxa" w:w="60"/>
+              <w:left w:type="dxa" w:w="100"/>
+              <w:bottom w:type="dxa" w:w="60"/>
+              <w:right w:type="dxa" w:w="100"/>
+            </w:tcMar>
+            <w:vAlign w:val="center"/>
+          </w:tcPr>
+          <w:p>
+            <w:pPr>
+              <w:spacing w:after="0"/>
+              <w:jc w:val="center"/>
+            </w:pPr>
+            <w:r>
+              <w:rPr>
+                <w:b w:val="false"/>
+                <w:bCs w:val="false"/>
+              </w:rPr>
+              <w:t xml:space="preserve">196,6</w:t>
+            </w:r>
+          </w:p>
+        </w:tc>
+        <w:tc>
+          <w:tcPr>
+            <w:tcW w:type="dxa" w:w="3023"/>
+            <w:tcMar>
+              <w:top w:type="dxa" w:w="60"/>
+              <w:left w:type="dxa" w:w="100"/>
+              <w:bottom w:type="dxa" w:w="60"/>
+              <w:right w:type="dxa" w:w="100"/>
+            </w:tcMar>
+            <w:vAlign w:val="center"/>
+          </w:tcPr>
+          <w:p>
+            <w:pPr>
+              <w:spacing w:after="0"/>
+              <w:jc w:val="center"/>
+            </w:pPr>
+            <w:r>
+              <w:rPr>
+                <w:b w:val="false"/>
+                <w:bCs w:val="false"/>
+              </w:rPr>
+              <w:t xml:space="preserve">1.369,4</w:t>
+            </w:r>
+          </w:p>
+        </w:tc>
+      </w:tr>
+      <w:tr>
+        <w:tc>
+          <w:tcPr>
+            <w:tcW w:type="dxa" w:w="3024"/>
+            <w:tcMar>
+              <w:top w:type="dxa" w:w="60"/>
+              <w:left w:type="dxa" w:w="100"/>
+              <w:bottom w:type="dxa" w:w="60"/>
+              <w:right w:type="dxa" w:w="100"/>
+            </w:tcMar>
+            <w:vAlign w:val="center"/>
+          </w:tcPr>
+          <w:p>
+            <w:pPr>
+              <w:spacing w:after="0"/>
+              <w:jc w:val="center"/>
+            </w:pPr>
+            <w:r>
+              <w:rPr>
+                <w:b w:val="false"/>
+                <w:bCs w:val="false"/>
+              </w:rPr>
+              <w:t xml:space="preserve">abril/2026</w:t>
+            </w:r>
+          </w:p>
+        </w:tc>
+        <w:tc>
+          <w:tcPr>
+            <w:tcW w:type="dxa" w:w="3024"/>
+            <w:tcMar>
+              <w:top w:type="dxa" w:w="60"/>
+              <w:left w:type="dxa" w:w="100"/>
+              <w:bottom w:type="dxa" w:w="60"/>
+              <w:right w:type="dxa" w:w="100"/>
+            </w:tcMar>
+            <w:vAlign w:val="center"/>
+          </w:tcPr>
+          <w:p>
+            <w:pPr>
+              <w:spacing w:after="0"/>
+              <w:jc w:val="center"/>
+            </w:pPr>
+            <w:r>
+              <w:rPr>
+                <w:b w:val="false"/>
+                <w:bCs w:val="false"/>
+              </w:rPr>
+              <w:t xml:space="preserve">293,8</w:t>
+            </w:r>
+          </w:p>
+        </w:tc>
+        <w:tc>
+          <w:tcPr>
+            <w:tcW w:type="dxa" w:w="3023"/>
+            <w:tcMar>
+              <w:top w:type="dxa" w:w="60"/>
+              <w:left w:type="dxa" w:w="100"/>
+              <w:bottom w:type="dxa" w:w="60"/>
+              <w:right w:type="dxa" w:w="100"/>
+            </w:tcMar>
+            <w:vAlign w:val="center"/>
+          </w:tcPr>
+          <w:p>
+            <w:pPr>
+              <w:spacing w:after="0"/>
+              <w:jc w:val="center"/>
+            </w:pPr>
+            <w:r>
+              <w:rPr>
+                <w:b w:val="false"/>
+                <w:bCs w:val="false"/>
+              </w:rPr>
+              <w:t xml:space="preserve">1.383,9</w:t>
+            </w:r>
+          </w:p>
+        </w:tc>
+      </w:tr>
+      <w:tr>
+        <w:tc>
+          <w:tcPr>
+            <w:tcW w:type="dxa" w:w="3024"/>
+            <w:tcMar>
+              <w:top w:type="dxa" w:w="60"/>
+              <w:left w:type="dxa" w:w="100"/>
+              <w:bottom w:type="dxa" w:w="60"/>
+              <w:right w:type="dxa" w:w="100"/>
+            </w:tcMar>
+            <w:vAlign w:val="center"/>
+          </w:tcPr>
+          <w:p>
+            <w:pPr>
+              <w:spacing w:after="0"/>
+              <w:jc w:val="center"/>
+            </w:pPr>
+            <w:r>
+              <w:rPr>
+                <w:b w:val="false"/>
+                <w:bCs w:val="false"/>
+              </w:rPr>
+              <w:t xml:space="preserve">maio/2026</w:t>
+            </w:r>
+          </w:p>
+        </w:tc>
+        <w:tc>
+          <w:tcPr>
+            <w:tcW w:type="dxa" w:w="3024"/>
+            <w:tcMar>
+              <w:top w:type="dxa" w:w="60"/>
+              <w:left w:type="dxa" w:w="100"/>
+              <w:bottom w:type="dxa" w:w="60"/>
+              <w:right w:type="dxa" w:w="100"/>
+            </w:tcMar>
+            <w:vAlign w:val="center"/>
+          </w:tcPr>
+          <w:p>
+            <w:pPr>
+              <w:spacing w:after="0"/>
+              <w:jc w:val="center"/>
+            </w:pPr>
+            <w:r>
+              <w:rPr>
+                <w:b w:val="false"/>
+                <w:bCs w:val="false"/>
+              </w:rPr>
+              <w:t xml:space="preserve">73,2</w:t>
+            </w:r>
+          </w:p>
+        </w:tc>
+        <w:tc>
+          <w:tcPr>
+            <w:tcW w:type="dxa" w:w="3023"/>
+            <w:tcMar>
+              <w:top w:type="dxa" w:w="60"/>
+              <w:left w:type="dxa" w:w="100"/>
+              <w:bottom w:type="dxa" w:w="60"/>
+              <w:right w:type="dxa" w:w="100"/>
+            </w:tcMar>
+            <w:vAlign w:val="center"/>
+          </w:tcPr>
+          <w:p>
+            <w:pPr>
+              <w:spacing w:after="0"/>
+              <w:jc w:val="center"/>
+            </w:pPr>
+            <w:r>
+              <w:rPr>
+                <w:b w:val="false"/>
+                <w:bCs w:val="false"/>
+              </w:rPr>
+              <w:t xml:space="preserve">977,8</w:t>
+            </w:r>
+          </w:p>
+        </w:tc>
+      </w:tr>
+      <w:tr>
+        <w:tc>
+          <w:tcPr>
+            <w:tcW w:type="dxa" w:w="3024"/>
+            <w:tcMar>
+              <w:top w:type="dxa" w:w="60"/>
+              <w:left w:type="dxa" w:w="100"/>
+              <w:bottom w:type="dxa" w:w="60"/>
+              <w:right w:type="dxa" w:w="100"/>
+            </w:tcMar>
+            <w:vAlign w:val="center"/>
+          </w:tcPr>
+          <w:p>
+            <w:pPr>
+              <w:spacing w:after="0"/>
+              <w:jc w:val="center"/>
+            </w:pPr>
+            <w:r>
+              <w:rPr>
+                <w:b w:val="false"/>
+                <w:bCs w:val="false"/>
+              </w:rPr>
+              <w:t xml:space="preserve">junho/2026</w:t>
+            </w:r>
+          </w:p>
+        </w:tc>
+        <w:tc>
+          <w:tcPr>
+            <w:tcW w:type="dxa" w:w="3024"/>
+            <w:tcMar>
+              <w:top w:type="dxa" w:w="60"/>
+              <w:left w:type="dxa" w:w="100"/>
+              <w:bottom w:type="dxa" w:w="60"/>
+              <w:right w:type="dxa" w:w="100"/>
+            </w:tcMar>
+            <w:vAlign w:val="center"/>
+          </w:tcPr>
+          <w:p>
+            <w:pPr>
+              <w:spacing w:after="0"/>
+              <w:jc w:val="center"/>
+            </w:pPr>
+            <w:r>
+              <w:rPr>
+                <w:b w:val="false"/>
+                <w:bCs w:val="false"/>
+              </w:rPr>
+              <w:t xml:space="preserve">26,2</w:t>
+            </w:r>
+          </w:p>
+        </w:tc>
+        <w:tc>
+          <w:tcPr>
+            <w:tcW w:type="dxa" w:w="3023"/>
+            <w:tcMar>
+              <w:top w:type="dxa" w:w="60"/>
+              <w:left w:type="dxa" w:w="100"/>
+              <w:bottom w:type="dxa" w:w="60"/>
+              <w:right w:type="dxa" w:w="100"/>
+            </w:tcMar>
+            <w:vAlign w:val="center"/>
+          </w:tcPr>
+          <w:p>
+            <w:pPr>
+              <w:spacing w:after="0"/>
+              <w:jc w:val="center"/>
+            </w:pPr>
+            <w:r>
+              <w:rPr>
+                <w:b w:val="false"/>
+                <w:bCs w:val="false"/>
+              </w:rPr>
+              <w:t xml:space="preserve">666,0</w:t>
+            </w:r>
+          </w:p>
+        </w:tc>
+      </w:tr>
+    </w:tbl>
+    <w:p>
+      <w:pPr>
+        <w:spacing w:after="120" w:before="120"/>
+        <w:jc w:val="both"/>
+      </w:pPr>
+      <w:r>
+        <w:t xml:space="preserve">Fonte: planilhas de monitoramento operacional da REVITA (acompanhamento diário de geração de chorume e medições topográficas de cota/volume da lagoa), que permanecem à disposição dessa fiscalização.</w:t>
       </w:r>
     </w:p>
     <w:sectPr>

</xml_diff>

<commit_message>
Adiciona gráficos e imagens ao Anexo II da resposta
Quatro gráficos (balanço teórico sem evaporação × volumes medidos com
linhas de capacidade, evolução da cota do nível, afluente mensal ×
precipitação 2026 e reapresentação do histórico climatológico de Altos/PI)
e a vista aérea da medição por drone na plataforma Propeller, embutidos no
.docx e referenciados no corpo da resposta. Inclui script gerador dos
gráficos.

Co-Authored-By: Claude Fable 5 <noreply@anthropic.com>
Claude-Session: https://claude.ai/code/session_01W45JqiFEv2J5UPsJhHMcdD
</commit_message>
<xml_diff>
--- a/Resposta_Oficio_2565-2026_ETURB.docx
+++ b/Resposta_Oficio_2565-2026_ETURB.docx
@@ -492,7 +492,7 @@
           <w:b w:val="false"/>
           <w:bCs w:val="false"/>
         </w:rPr>
-        <w:t xml:space="preserve">.</w:t>
+        <w:t xml:space="preserve"> (Tabelas 1 e 2, Gráficos 1 a 4 e Figura 1).</w:t>
       </w:r>
     </w:p>
     <w:p>
@@ -761,7 +761,7 @@
           <w:b w:val="false"/>
           <w:bCs w:val="false"/>
         </w:rPr>
-        <w:t xml:space="preserve">I – Cronograma físico revisado de implantação da ETE; II – Síntese dos dados operacionais de monitoramento da lagoa de percolado.</w:t>
+        <w:t xml:space="preserve">I – Cronograma físico revisado de implantação da ETE; II – Síntese dos dados operacionais de monitoramento da lagoa de percolado (tabelas, gráficos e registro aerofotogramétrico).</w:t>
       </w:r>
     </w:p>
     <w:p>
@@ -3083,6 +3083,301 @@
       </w:pPr>
       <w:r>
         <w:t xml:space="preserve">Fonte: planilhas de monitoramento operacional da REVITA (acompanhamento diário de geração de chorume e medições topográficas de cota/volume da lagoa), que permanecem à disposição dessa fiscalização.</w:t>
+      </w:r>
+    </w:p>
+    <w:p>
+      <w:pPr>
+        <w:spacing w:after="60" w:before="240"/>
+        <w:jc w:val="both"/>
+      </w:pPr>
+      <w:r>
+        <w:rPr>
+          <w:b/>
+          <w:bCs/>
+        </w:rPr>
+        <w:t xml:space="preserve">Gráfico 1 – Estoque de percolado: balanço teórico sem evaporação (série do estudo encaminhado com o Ofício nº 014/2026) × volume efetivamente medido por topografia/drone, confrontados com as capacidades de armazenamento</w:t>
+      </w:r>
+    </w:p>
+    <w:p>
+      <w:pPr>
+        <w:spacing w:after="120"/>
+        <w:jc w:val="center"/>
+      </w:pPr>
+      <w:r>
+        <w:drawing>
+          <wp:inline distT="0" distB="0" distL="0" distR="0">
+            <wp:extent cx="5762625" cy="2914650"/>
+            <wp:effectExtent t="0" r="0" b="0" l="0"/>
+            <wp:docPr id="1" name="" descr="" title=""/>
+            <wp:cNvGraphicFramePr>
+              <a:graphicFrameLocks xmlns:a="http://schemas.openxmlformats.org/drawingml/2006/main" noChangeAspect="1"/>
+            </wp:cNvGraphicFramePr>
+            <a:graphic xmlns:a="http://schemas.openxmlformats.org/drawingml/2006/main">
+              <a:graphicData uri="http://schemas.openxmlformats.org/drawingml/2006/picture">
+                <pic:pic xmlns:pic="http://schemas.openxmlformats.org/drawingml/2006/picture">
+                  <pic:nvPicPr>
+                    <pic:cNvPr id="0" name="" descr=""/>
+                    <pic:cNvPicPr>
+                      <a:picLocks noChangeAspect="1" noChangeArrowheads="1"/>
+                    </pic:cNvPicPr>
+                  </pic:nvPicPr>
+                  <pic:blipFill>
+                    <a:blip r:embed="rId7" cstate="none"/>
+                    <a:srcRect/>
+                    <a:stretch>
+                      <a:fillRect/>
+                    </a:stretch>
+                  </pic:blipFill>
+                  <pic:spPr bwMode="auto">
+                    <a:xfrm>
+                      <a:off x="0" y="0"/>
+                      <a:ext cx="5762625" cy="2914650"/>
+                    </a:xfrm>
+                    <a:prstGeom prst="rect">
+                      <a:avLst/>
+                    </a:prstGeom>
+                  </pic:spPr>
+                </pic:pic>
+              </a:graphicData>
+            </a:graphic>
+          </wp:inline>
+        </w:drawing>
+      </w:r>
+    </w:p>
+    <w:p>
+      <w:pPr>
+        <w:spacing w:after="60" w:before="240"/>
+        <w:jc w:val="both"/>
+      </w:pPr>
+      <w:r>
+        <w:rPr>
+          <w:b/>
+          <w:bCs/>
+        </w:rPr>
+        <w:t xml:space="preserve">Gráfico 2 – Evolução da cota do nível da lagoa em operação (leituras topográficas semanais, fev–jul/2026)</w:t>
+      </w:r>
+    </w:p>
+    <w:p>
+      <w:pPr>
+        <w:spacing w:after="120"/>
+        <w:jc w:val="center"/>
+      </w:pPr>
+      <w:r>
+        <w:drawing>
+          <wp:inline distT="0" distB="0" distL="0" distR="0">
+            <wp:extent cx="5762625" cy="2533650"/>
+            <wp:effectExtent t="0" r="0" b="0" l="0"/>
+            <wp:docPr id="1" name="" descr="" title=""/>
+            <wp:cNvGraphicFramePr>
+              <a:graphicFrameLocks xmlns:a="http://schemas.openxmlformats.org/drawingml/2006/main" noChangeAspect="1"/>
+            </wp:cNvGraphicFramePr>
+            <a:graphic xmlns:a="http://schemas.openxmlformats.org/drawingml/2006/main">
+              <a:graphicData uri="http://schemas.openxmlformats.org/drawingml/2006/picture">
+                <pic:pic xmlns:pic="http://schemas.openxmlformats.org/drawingml/2006/picture">
+                  <pic:nvPicPr>
+                    <pic:cNvPr id="0" name="" descr=""/>
+                    <pic:cNvPicPr>
+                      <a:picLocks noChangeAspect="1" noChangeArrowheads="1"/>
+                    </pic:cNvPicPr>
+                  </pic:nvPicPr>
+                  <pic:blipFill>
+                    <a:blip r:embed="rId8" cstate="none"/>
+                    <a:srcRect/>
+                    <a:stretch>
+                      <a:fillRect/>
+                    </a:stretch>
+                  </pic:blipFill>
+                  <pic:spPr bwMode="auto">
+                    <a:xfrm>
+                      <a:off x="0" y="0"/>
+                      <a:ext cx="5762625" cy="2533650"/>
+                    </a:xfrm>
+                    <a:prstGeom prst="rect">
+                      <a:avLst/>
+                    </a:prstGeom>
+                  </pic:spPr>
+                </pic:pic>
+              </a:graphicData>
+            </a:graphic>
+          </wp:inline>
+        </w:drawing>
+      </w:r>
+    </w:p>
+    <w:p>
+      <w:pPr>
+        <w:spacing w:after="60" w:before="240"/>
+        <w:jc w:val="both"/>
+      </w:pPr>
+      <w:r>
+        <w:rPr>
+          <w:b/>
+          <w:bCs/>
+        </w:rPr>
+        <w:t xml:space="preserve">Gráfico 3 – Afluente total à lagoa e precipitação registrada no aterro em 2026</w:t>
+      </w:r>
+    </w:p>
+    <w:p>
+      <w:pPr>
+        <w:spacing w:after="120"/>
+        <w:jc w:val="center"/>
+      </w:pPr>
+      <w:r>
+        <w:drawing>
+          <wp:inline distT="0" distB="0" distL="0" distR="0">
+            <wp:extent cx="5762625" cy="3419475"/>
+            <wp:effectExtent t="0" r="0" b="0" l="0"/>
+            <wp:docPr id="1" name="" descr="" title=""/>
+            <wp:cNvGraphicFramePr>
+              <a:graphicFrameLocks xmlns:a="http://schemas.openxmlformats.org/drawingml/2006/main" noChangeAspect="1"/>
+            </wp:cNvGraphicFramePr>
+            <a:graphic xmlns:a="http://schemas.openxmlformats.org/drawingml/2006/main">
+              <a:graphicData uri="http://schemas.openxmlformats.org/drawingml/2006/picture">
+                <pic:pic xmlns:pic="http://schemas.openxmlformats.org/drawingml/2006/picture">
+                  <pic:nvPicPr>
+                    <pic:cNvPr id="0" name="" descr=""/>
+                    <pic:cNvPicPr>
+                      <a:picLocks noChangeAspect="1" noChangeArrowheads="1"/>
+                    </pic:cNvPicPr>
+                  </pic:nvPicPr>
+                  <pic:blipFill>
+                    <a:blip r:embed="rId9" cstate="none"/>
+                    <a:srcRect/>
+                    <a:stretch>
+                      <a:fillRect/>
+                    </a:stretch>
+                  </pic:blipFill>
+                  <pic:spPr bwMode="auto">
+                    <a:xfrm>
+                      <a:off x="0" y="0"/>
+                      <a:ext cx="5762625" cy="3419475"/>
+                    </a:xfrm>
+                    <a:prstGeom prst="rect">
+                      <a:avLst/>
+                    </a:prstGeom>
+                  </pic:spPr>
+                </pic:pic>
+              </a:graphicData>
+            </a:graphic>
+          </wp:inline>
+        </w:drawing>
+      </w:r>
+    </w:p>
+    <w:p>
+      <w:pPr>
+        <w:spacing w:after="60" w:before="240"/>
+        <w:jc w:val="both"/>
+      </w:pPr>
+      <w:r>
+        <w:rPr>
+          <w:b/>
+          <w:bCs/>
+        </w:rPr>
+        <w:t xml:space="preserve">Gráfico 4 – Histórico climatológico do município de Altos/PI: temperatura média, umidade relativa e pluviometria mensal (reapresentação — Ofício nº 014/2026)</w:t>
+      </w:r>
+    </w:p>
+    <w:p>
+      <w:pPr>
+        <w:spacing w:after="120"/>
+        <w:jc w:val="center"/>
+      </w:pPr>
+      <w:r>
+        <w:drawing>
+          <wp:inline distT="0" distB="0" distL="0" distR="0">
+            <wp:extent cx="5762625" cy="3333750"/>
+            <wp:effectExtent t="0" r="0" b="0" l="0"/>
+            <wp:docPr id="1" name="" descr="" title=""/>
+            <wp:cNvGraphicFramePr>
+              <a:graphicFrameLocks xmlns:a="http://schemas.openxmlformats.org/drawingml/2006/main" noChangeAspect="1"/>
+            </wp:cNvGraphicFramePr>
+            <a:graphic xmlns:a="http://schemas.openxmlformats.org/drawingml/2006/main">
+              <a:graphicData uri="http://schemas.openxmlformats.org/drawingml/2006/picture">
+                <pic:pic xmlns:pic="http://schemas.openxmlformats.org/drawingml/2006/picture">
+                  <pic:nvPicPr>
+                    <pic:cNvPr id="0" name="" descr=""/>
+                    <pic:cNvPicPr>
+                      <a:picLocks noChangeAspect="1" noChangeArrowheads="1"/>
+                    </pic:cNvPicPr>
+                  </pic:nvPicPr>
+                  <pic:blipFill>
+                    <a:blip r:embed="rId10" cstate="none"/>
+                    <a:srcRect/>
+                    <a:stretch>
+                      <a:fillRect/>
+                    </a:stretch>
+                  </pic:blipFill>
+                  <pic:spPr bwMode="auto">
+                    <a:xfrm>
+                      <a:off x="0" y="0"/>
+                      <a:ext cx="5762625" cy="3333750"/>
+                    </a:xfrm>
+                    <a:prstGeom prst="rect">
+                      <a:avLst/>
+                    </a:prstGeom>
+                  </pic:spPr>
+                </pic:pic>
+              </a:graphicData>
+            </a:graphic>
+          </wp:inline>
+        </w:drawing>
+      </w:r>
+    </w:p>
+    <w:p>
+      <w:pPr>
+        <w:spacing w:after="60" w:before="240"/>
+        <w:jc w:val="both"/>
+      </w:pPr>
+      <w:r>
+        <w:rPr>
+          <w:b/>
+          <w:bCs/>
+        </w:rPr>
+        <w:t xml:space="preserve">Figura 1 – Vista aérea da lagoa em operação e medição aerofotogramétrica do volume armazenado na plataforma Propeller (levantamento de 13/07/2026)</w:t>
+      </w:r>
+    </w:p>
+    <w:p>
+      <w:pPr>
+        <w:spacing w:after="120"/>
+        <w:jc w:val="center"/>
+      </w:pPr>
+      <w:r>
+        <w:drawing>
+          <wp:inline distT="0" distB="0" distL="0" distR="0">
+            <wp:extent cx="5762625" cy="2724150"/>
+            <wp:effectExtent t="0" r="0" b="0" l="0"/>
+            <wp:docPr id="1" name="" descr="" title=""/>
+            <wp:cNvGraphicFramePr>
+              <a:graphicFrameLocks xmlns:a="http://schemas.openxmlformats.org/drawingml/2006/main" noChangeAspect="1"/>
+            </wp:cNvGraphicFramePr>
+            <a:graphic xmlns:a="http://schemas.openxmlformats.org/drawingml/2006/main">
+              <a:graphicData uri="http://schemas.openxmlformats.org/drawingml/2006/picture">
+                <pic:pic xmlns:pic="http://schemas.openxmlformats.org/drawingml/2006/picture">
+                  <pic:nvPicPr>
+                    <pic:cNvPr id="0" name="" descr=""/>
+                    <pic:cNvPicPr>
+                      <a:picLocks noChangeAspect="1" noChangeArrowheads="1"/>
+                    </pic:cNvPicPr>
+                  </pic:nvPicPr>
+                  <pic:blipFill>
+                    <a:blip r:embed="rId11" cstate="none"/>
+                    <a:srcRect/>
+                    <a:stretch>
+                      <a:fillRect/>
+                    </a:stretch>
+                  </pic:blipFill>
+                  <pic:spPr bwMode="auto">
+                    <a:xfrm>
+                      <a:off x="0" y="0"/>
+                      <a:ext cx="5762625" cy="2724150"/>
+                    </a:xfrm>
+                    <a:prstGeom prst="rect">
+                      <a:avLst/>
+                    </a:prstGeom>
+                  </pic:spPr>
+                </pic:pic>
+              </a:graphicData>
+            </a:graphic>
+          </wp:inline>
+        </w:drawing>
       </w:r>
     </w:p>
     <w:sectPr>

</xml_diff>

<commit_message>
Fundamenta defesa contratual no PB do Credenciamento
Substitui a menção genérica ao Credenciamento por fundamentação precisa:
Plano de Trabalho vigente prevê drenagem + lagoa (cumprido e ampliado),
requisito de sistema próprio de tratamento no item 6.2.2 do PB do
Credenciamento sem prazo fixado, conclusão do cronograma dentro do
primeiro terço da vigência de 24 meses do novo contrato e Indicador de
desempenho nº 5 (gestão de lixiviado tratado ou destinado >= 95%).

Co-Authored-By: Claude Fable 5 <noreply@anthropic.com>
Claude-Session: https://claude.ai/code/session_01W45JqiFEv2J5UPsJhHMcdD
</commit_message>
<xml_diff>
--- a/Resposta_Oficio_2565-2026_ETURB.docx
+++ b/Resposta_Oficio_2565-2026_ETURB.docx
@@ -501,7 +501,16 @@
         <w:jc w:val="both"/>
       </w:pPr>
       <w:r>
-        <w:t xml:space="preserve">Cumpre observar, com o devido respeito e sem embargo das relevantes competências fiscalizatórias dessa Autarquia no plano contratual, que a avaliação acerca da existência de risco ambiental e da suficiência das medidas de gerenciamento de percolado insere-se na esfera de competência do órgão ambiental licenciador (SEMARH/PI), que acompanha regularmente o empreendimento e suas condicionantes e que, até o presente momento, não formulou qualquer apontamento de risco ou objeção às medidas implementadas. No plano contratual, registre-se que a implantação da solução definitiva de tratamento encontra previsão no Projeto Básico vinculado ao Credenciamento, cujas diretrizes e etapas vêm sendo fielmente observadas por esta empresa, conforme cronograma ora apresentado.</w:t>
+        <w:t xml:space="preserve">Cumpre observar, com o devido respeito e sem embargo das relevantes competências fiscalizatórias dessa Autarquia no plano contratual, que a avaliação acerca da existência de risco ambiental e da suficiência das medidas de gerenciamento de percolado insere-se na esfera de competência do órgão ambiental licenciador (SEMARH/PI), que acompanha regularmente o empreendimento e suas condicionantes e que, até o presente momento, não formulou qualquer apontamento de risco ou objeção às medidas implementadas.</w:t>
+      </w:r>
+    </w:p>
+    <w:p>
+      <w:pPr>
+        <w:spacing w:after="120" w:before="0"/>
+        <w:jc w:val="both"/>
+      </w:pPr>
+      <w:r>
+        <w:t xml:space="preserve">No plano contratual, cumpre registrar que o Plano de Trabalho vigente do Contrato nº 13011131/2025 contempla o gerenciamento do percolado por meio de sistema de drenagem e lagoa de acumulação — obrigação integralmente cumprida e, inclusive, ampliada por esta empresa com a implantação da segunda lagoa de acumulação. A implantação de sistema próprio de tratamento de chorume, por sua vez, constitui requisito do Projeto Básico do Credenciamento em curso (item 6.2.2), sem prazo específico ali fixado, e vem sendo endereçada de forma planejada e transparente por esta empresa, conforme cronograma ora apresentado, cuja conclusão ocorrerá ainda no primeiro terço da vigência de 24 (vinte e quatro) meses do novo instrumento contratual. Anote-se, ademais, que os indicadores de desempenho do mesmo Projeto Básico reputam adequada a gestão de lixiviado quando o volume gerado é tratado ou destinado em percentual igual ou superior a 95% (Indicador nº 5) — condição plenamente atendida pelo sistema de acumulação e evaporação em operação, que gerencia a integralidade do percolado gerado, sem lançamento de efluentes em corpos hídricos.</w:t>
       </w:r>
     </w:p>
     <w:p>

</xml_diff>